<commit_message>
NSRU: rename project title (teacher review) + abstract, slides, video script
- Title -> "กับดักพิษแปรผัน: การศึกษาพฤติกรรมการเรียนรู้เพื่อหลีกเลี่ยงอันตรายของ
  ปัญญาประดิษฐ์ในสภาพแวดล้อมจำลอง" (reflects IV/DV per advisor) across report
  cover/inner-cover, standalone abstract, slide 1, video script header.
- Add standalone บทคัดย่อ (.docx/.pdf, 1 page), 15-min video script, and a
  10-slide Thai deck (pptxgenjs; figures embedded; narration in speaker notes).
- Translate the leftover English annotation in toxin_fig3 learning curve to Thai.
</commit_message>
<xml_diff>
--- a/reports/nsru_report_food_toxin_2026-07-11.th.docx
+++ b/reports/nsru_report_food_toxin_2026-07-11.th.docx
@@ -33,7 +33,7 @@
           <w:sz w:val="32"/>
           <w:szCs w:val="32"/>
         </w:rPr>
-        <w:t xml:space="preserve">AI ที่เรียนรู้เองว่าอะไรกินได้และอะไรเป็นพิษ และกับดักของ "พิษที่หายได้":</w:t>
+        <w:t xml:space="preserve">กับดักพิษแปรผัน:</w:t>
       </w:r>
     </w:p>
     <w:p>
@@ -51,7 +51,7 @@
           <w:sz w:val="32"/>
           <w:szCs w:val="32"/>
         </w:rPr>
-        <w:t xml:space="preserve">บทเรียนความปลอดภัยจากโลกจำลองสิ่งมีชีวิตที่ไม่มีป้ายกำกับ (Artificial Evolution)</w:t>
+        <w:t xml:space="preserve">การศึกษาพฤติกรรมการเรียนรู้เพื่อหลีกเลี่ยงอันตรายของปัญญาประดิษฐ์ในสภาพแวดล้อมจำลอง</w:t>
       </w:r>
     </w:p>
     <w:p>
@@ -290,7 +290,7 @@
           <w:sz w:val="32"/>
           <w:szCs w:val="32"/>
         </w:rPr>
-        <w:t xml:space="preserve">AI ที่เรียนรู้เองว่าอะไรกินได้และอะไรเป็นพิษ และกับดักของ "พิษที่หายได้":</w:t>
+        <w:t xml:space="preserve">กับดักพิษแปรผัน:</w:t>
       </w:r>
     </w:p>
     <w:p>
@@ -308,7 +308,7 @@
           <w:sz w:val="32"/>
           <w:szCs w:val="32"/>
         </w:rPr>
-        <w:t xml:space="preserve">บทเรียนความปลอดภัยจากโลกจำลองสิ่งมีชีวิตที่ไม่มีป้ายกำกับ (Artificial Evolution)</w:t>
+        <w:t xml:space="preserve">การศึกษาพฤติกรรมการเรียนรู้เพื่อหลีกเลี่ยงอันตรายของปัญญาประดิษฐ์ในสภาพแวดล้อมจำลอง</w:t>
       </w:r>
     </w:p>
     <w:p>

</xml_diff>